<commit_message>
Conference: formatting corrections from reviewer PDF (bold-italic Keywords, one-line TABLE N. captions, full-column-width tables, figure PNG whitespace trimmed + tighter caption skip); DOCX twin regenerated; user's title/prose edits included
</commit_message>
<xml_diff>
--- a/Multi_Horizon_Hazard_Models_for_Battery_Failure_Prediction_Within.docx
+++ b/Multi_Horizon_Hazard_Models_for_Battery_Failure_Prediction_Within.docx
@@ -8,7 +8,7 @@
         <w:spacing w:after="120"/>
       </w:pPr>
       <w:r>
-        <w:t xml:space="preserve">Multi-Horizon Failure-Risk Models for Battery Failure Prediction: Within-Dataset Reliability, Cross-Chemistry Transferability, and Calibration Analysis</w:t>
+        <w:t xml:space="preserve">When Battery Failure Models Appear to Transfer: Exposing Health-State Shortcuts Under Dataset and Chemistry Shift</w:t>
       </w:r>
     </w:p>
     <w:sectPr>
@@ -428,25 +428,47 @@
       </w:pPr>
       <w:r>
         <w:rPr>
+          <w:b/>
+          <w:bCs/>
           <w:i/>
           <w:iCs/>
         </w:rPr>
         <w:t xml:space="preserve">Keywords—</w:t>
       </w:r>
       <w:r>
-        <w:t xml:space="preserve">battery management systems, machine</w:t>
-      </w:r>
-      <w:r>
-        <w:t xml:space="preserve"> </w:t>
-      </w:r>
-      <w:r>
-        <w:t xml:space="preserve">learning, probability calibration, prognostics and health management,</w:t>
-      </w:r>
-      <w:r>
-        <w:t xml:space="preserve"> </w:t>
-      </w:r>
-      <w:r>
-        <w:t xml:space="preserve">transfer learning, dataset shift.</w:t>
+        <w:rPr>
+          <w:i/>
+          <w:iCs/>
+        </w:rPr>
+        <w:t xml:space="preserve">battery management</w:t>
+      </w:r>
+      <w:r>
+        <w:rPr>
+          <w:i/>
+          <w:iCs/>
+        </w:rPr>
+        <w:t xml:space="preserve"> </w:t>
+      </w:r>
+      <w:r>
+        <w:rPr>
+          <w:i/>
+          <w:iCs/>
+        </w:rPr>
+        <w:t xml:space="preserve">systems, machine learning, probability calibration, prognostics and</w:t>
+      </w:r>
+      <w:r>
+        <w:rPr>
+          <w:i/>
+          <w:iCs/>
+        </w:rPr>
+        <w:t xml:space="preserve"> </w:t>
+      </w:r>
+      <w:r>
+        <w:rPr>
+          <w:i/>
+          <w:iCs/>
+        </w:rPr>
+        <w:t xml:space="preserve">health management, transfer learning, dataset shift.</w:t>
       </w:r>
     </w:p>
     <w:bookmarkStart w:id="9" w:name="i.-introduction-and-related-work"/>
@@ -909,7 +931,7 @@
       <w:r>
         <w:drawing>
           <wp:inline>
-            <wp:extent cx="3201929" cy="3201929"/>
+            <wp:extent cx="5334000" cy="4662766"/>
             <wp:effectExtent b="0" l="0" r="0" t="0"/>
             <wp:docPr descr="" title="" id="11" name="Picture"/>
             <a:graphic>
@@ -930,7 +952,7 @@
                   <pic:spPr bwMode="auto">
                     <a:xfrm>
                       <a:off x="0" y="0"/>
-                      <a:ext cx="3201929" cy="3201929"/>
+                      <a:ext cx="5334000" cy="4662766"/>
                     </a:xfrm>
                     <a:prstGeom prst="rect">
                       <a:avLst/>
@@ -3571,13 +3593,19 @@
         <w:t xml:space="preserve"> </w:t>
       </w:r>
       <w:r>
-        <w:t xml:space="preserve">treats every cycle-level prediction as independent, so within-cell</w:t>
-      </w:r>
-      <w:r>
-        <w:t xml:space="preserve"> </w:t>
-      </w:r>
-      <w:r>
-        <w:t xml:space="preserve">correlation inflates its</w:t>
+        <w:t xml:space="preserve">treats cycle-level predictions as independent despite within-cell</w:t>
+      </w:r>
+      <w:r>
+        <w:t xml:space="preserve"> </w:t>
+      </w:r>
+      <w:r>
+        <w:t xml:space="preserve">correlation, which can produce anti-conservative inference and</w:t>
+      </w:r>
+      <w:r>
+        <w:t xml:space="preserve"> </w:t>
+      </w:r>
+      <w:r>
+        <w:t xml:space="preserve">artificially small</w:t>
       </w:r>
       <w:r>
         <w:t xml:space="preserve"> </w:t>
@@ -3588,19 +3616,13 @@
         </m:r>
       </m:oMath>
       <w:r>
-        <w:t xml:space="preserve">-values (pseudoreplication), and we read it</w:t>
-      </w:r>
-      <w:r>
-        <w:t xml:space="preserve"> </w:t>
-      </w:r>
-      <w:r>
-        <w:t xml:space="preserve">as a directional consistency check, never as a precise significance</w:t>
-      </w:r>
-      <w:r>
-        <w:t xml:space="preserve"> </w:t>
-      </w:r>
-      <w:r>
-        <w:t xml:space="preserve">statement.</w:t>
+        <w:t xml:space="preserve">-values (pseudoreplication). We therefore use</w:t>
+      </w:r>
+      <w:r>
+        <w:t xml:space="preserve"> </w:t>
+      </w:r>
+      <w:r>
+        <w:t xml:space="preserve">DeLong only as a directional consistency check.</w:t>
       </w:r>
     </w:p>
     <w:bookmarkEnd w:id="19"/>
@@ -3673,7 +3695,7 @@
         <w:pStyle w:val="TableCaption"/>
       </w:pPr>
       <w:r>
-        <w:t xml:space="preserve">Within-Dataset Platt-Calibrated AUC and Brier Score</w:t>
+        <w:t xml:space="preserve">Within-Dataset AUC and Brier Score</w:t>
       </w:r>
     </w:p>
     <w:tbl>
@@ -3681,7 +3703,7 @@
         <w:tblStyle w:val="Table"/>
         <w:tblW w:type="auto" w:w="0"/>
         <w:tblLook w:firstRow="1" w:lastRow="0" w:firstColumn="0" w:lastColumn="0" w:noHBand="0" w:noVBand="0" w:val="0020"/>
-        <w:tblCaption w:val="Within-Dataset Platt-Calibrated AUC and Brier Score"/>
+        <w:tblCaption w:val="Within-Dataset AUC and Brier Score"/>
         <w:tblBorders>
           <w:top w:val="single" w:sz="8" w:color="000000"/>
           <w:bottom w:val="single" w:sz="8" w:color="000000"/>
@@ -5005,7 +5027,7 @@
       <w:r>
         <w:drawing>
           <wp:inline>
-            <wp:extent cx="3156056" cy="1562737"/>
+            <wp:extent cx="5334000" cy="2584302"/>
             <wp:effectExtent b="0" l="0" r="0" t="0"/>
             <wp:docPr descr="" title="" id="23" name="Picture"/>
             <a:graphic>
@@ -5026,7 +5048,7 @@
                   <pic:spPr bwMode="auto">
                     <a:xfrm>
                       <a:off x="0" y="0"/>
-                      <a:ext cx="3156056" cy="1562737"/>
+                      <a:ext cx="5334000" cy="2584302"/>
                     </a:xfrm>
                     <a:prstGeom prst="rect">
                       <a:avLst/>
@@ -5060,7 +5082,7 @@
         <w:pStyle w:val="TableCaption"/>
       </w:pPr>
       <w:r>
-        <w:t xml:space="preserve">Calibration Method Comparison (Mean Across Tree Models)</w:t>
+        <w:t xml:space="preserve">Calibration Method Comparison</w:t>
       </w:r>
     </w:p>
     <w:tbl>
@@ -5068,7 +5090,7 @@
         <w:tblStyle w:val="Table"/>
         <w:tblW w:type="auto" w:w="0"/>
         <w:tblLook w:firstRow="1" w:lastRow="0" w:firstColumn="0" w:lastColumn="0" w:noHBand="0" w:noVBand="0" w:val="0020"/>
-        <w:tblCaption w:val="Calibration Method Comparison (Mean Across Tree Models)"/>
+        <w:tblCaption w:val="Calibration Method Comparison"/>
         <w:tblBorders>
           <w:top w:val="single" w:sz="8" w:color="000000"/>
           <w:bottom w:val="single" w:sz="8" w:color="000000"/>
@@ -5936,7 +5958,7 @@
       <w:r>
         <w:drawing>
           <wp:inline>
-            <wp:extent cx="3253918" cy="1737054"/>
+            <wp:extent cx="5334000" cy="2850497"/>
             <wp:effectExtent b="0" l="0" r="0" t="0"/>
             <wp:docPr descr="" title="" id="29" name="Picture"/>
             <a:graphic>
@@ -5957,7 +5979,7 @@
                   <pic:spPr bwMode="auto">
                     <a:xfrm>
                       <a:off x="0" y="0"/>
-                      <a:ext cx="3253918" cy="1737054"/>
+                      <a:ext cx="5334000" cy="2850497"/>
                     </a:xfrm>
                     <a:prstGeom prst="rect">
                       <a:avLst/>
@@ -6161,7 +6183,7 @@
         <w:t xml:space="preserve"> </w:t>
       </w:r>
       <w:r>
-        <w:t xml:space="preserve">With and Without SOH (Pooled Raw AUC)</w:t>
+        <w:t xml:space="preserve">(Pooled Raw AUC)</w:t>
       </w:r>
     </w:p>
     <w:tbl>
@@ -6169,7 +6191,7 @@
         <w:tblStyle w:val="Table"/>
         <w:tblW w:type="auto" w:w="0"/>
         <w:tblLook w:firstRow="1" w:lastRow="0" w:firstColumn="0" w:lastColumn="0" w:noHBand="0" w:noVBand="0" w:val="0020"/>
-        <w:tblCaption w:val="Cross-Dataset Transfer at H{=}20 With and Without SOH (Pooled Raw AUC)"/>
+        <w:tblCaption w:val="Cross-Dataset Transfer at H{=}20 (Pooled Raw AUC)"/>
         <w:tblBorders>
           <w:top w:val="single" w:sz="8" w:color="000000"/>
           <w:bottom w:val="single" w:sz="8" w:color="000000"/>
@@ -7589,7 +7611,7 @@
       <w:r>
         <w:drawing>
           <wp:inline>
-            <wp:extent cx="3217220" cy="1672832"/>
+            <wp:extent cx="5334000" cy="2751382"/>
             <wp:effectExtent b="0" l="0" r="0" t="0"/>
             <wp:docPr descr="" title="" id="35" name="Picture"/>
             <a:graphic>
@@ -7610,7 +7632,7 @@
                   <pic:spPr bwMode="auto">
                     <a:xfrm>
                       <a:off x="0" y="0"/>
-                      <a:ext cx="3217220" cy="1672832"/>
+                      <a:ext cx="5334000" cy="2751382"/>
                     </a:xfrm>
                     <a:prstGeom prst="rect">
                       <a:avLst/>
@@ -7802,19 +7824,19 @@
         <w:t xml:space="preserve"> </w:t>
       </w:r>
       <w:r>
-        <w:t xml:space="preserve">under the voltage label (0.723 versus 0.611 without SOH) indicates</w:t>
-      </w:r>
-      <w:r>
-        <w:t xml:space="preserve"> </w:t>
-      </w:r>
-      <w:r>
-        <w:t xml:space="preserve">genuine but weak health-state information: cells far below nominal</w:t>
-      </w:r>
-      <w:r>
-        <w:t xml:space="preserve"> </w:t>
-      </w:r>
-      <w:r>
-        <w:t xml:space="preserve">capacity fail sooner under almost any definition.</w:t>
+        <w:t xml:space="preserve">under the voltage-sag endpoint (0.723 versus 0.611 without SOH) is</w:t>
+      </w:r>
+      <w:r>
+        <w:t xml:space="preserve"> </w:t>
+      </w:r>
+      <w:r>
+        <w:t xml:space="preserve">consistent with SOH retaining some genuine health-state information</w:t>
+      </w:r>
+      <w:r>
+        <w:t xml:space="preserve"> </w:t>
+      </w:r>
+      <w:r>
+        <w:t xml:space="preserve">even when it does not directly define the endpoint.</w:t>
       </w:r>
     </w:p>
     <w:bookmarkStart w:id="39" w:name="tab:faildef"/>
@@ -7842,19 +7864,13 @@
           <m:t>20</m:t>
         </m:r>
       </m:oMath>
-      <w:r>
-        <w:t xml:space="preserve"> </w:t>
-      </w:r>
-      <w:r>
-        <w:t xml:space="preserve">(Pooled Raw AUC)</w:t>
-      </w:r>
     </w:p>
     <w:tbl>
       <w:tblPr>
         <w:tblStyle w:val="Table"/>
         <w:tblW w:type="auto" w:w="0"/>
         <w:tblLook w:firstRow="1" w:lastRow="0" w:firstColumn="0" w:lastColumn="0" w:noHBand="0" w:noVBand="0" w:val="0020"/>
-        <w:tblCaption w:val="Failure-Definition Ablation at H{=}20 (Pooled Raw AUC)"/>
+        <w:tblCaption w:val="Failure-Definition Ablation at H{=}20"/>
         <w:tblBorders>
           <w:top w:val="single" w:sz="8" w:color="000000"/>
           <w:bottom w:val="single" w:sz="8" w:color="000000"/>
@@ -8279,19 +8295,13 @@
           <m:t>20</m:t>
         </m:r>
       </m:oMath>
-      <w:r>
-        <w:t xml:space="preserve"> </w:t>
-      </w:r>
-      <w:r>
-        <w:t xml:space="preserve">(Pooled Raw AUC)</w:t>
-      </w:r>
     </w:p>
     <w:tbl>
       <w:tblPr>
         <w:tblStyle w:val="Table"/>
         <w:tblW w:type="auto" w:w="0"/>
         <w:tblLook w:firstRow="1" w:lastRow="0" w:firstColumn="0" w:lastColumn="0" w:noHBand="0" w:noVBand="0" w:val="0020"/>
-        <w:tblCaption w:val="Same-Chemistry Controls at H{=}20 (Pooled Raw AUC)"/>
+        <w:tblCaption w:val="Same-Chemistry Controls at H{=}20"/>
         <w:tblBorders>
           <w:top w:val="single" w:sz="8" w:color="000000"/>
           <w:bottom w:val="single" w:sz="8" w:color="000000"/>
@@ -10645,13 +10655,13 @@
       </w:r>
     </w:p>
     <w:bookmarkEnd w:id="43"/>
-    <w:bookmarkStart w:id="46" w:name="iii-f-operational-cost-analysis"/>
+    <w:bookmarkStart w:id="46" w:name="iii-f-operational-threshold-evaluation"/>
     <w:p>
       <w:pPr>
         <w:pStyle w:val="Heading2"/>
       </w:pPr>
       <w:r>
-        <w:t xml:space="preserve">III-F Operational Cost Analysis</w:t>
+        <w:t xml:space="preserve">III-F Operational Threshold Evaluation</w:t>
       </w:r>
     </w:p>
     <w:p>
@@ -10745,7 +10755,7 @@
         <w:t xml:space="preserve"> </w:t>
       </w:r>
       <w:r>
-        <w:t xml:space="preserve">(Target FNR% / FPR%)</w:t>
+        <w:t xml:space="preserve">(FNR% / FPR%)</w:t>
       </w:r>
     </w:p>
     <w:tbl>
@@ -10753,7 +10763,7 @@
         <w:tblStyle w:val="Table"/>
         <w:tblW w:type="auto" w:w="0"/>
         <w:tblLook w:firstRow="1" w:lastRow="0" w:firstColumn="0" w:lastColumn="0" w:noHBand="0" w:noVBand="0" w:val="0020"/>
-        <w:tblCaption w:val="Operational Evaluation at H{=}20 (Target FNR% / FPR%)"/>
+        <w:tblCaption w:val="Operational Evaluation at H{=}20 (FNR% / FPR%)"/>
         <w:tblBorders>
           <w:top w:val="single" w:sz="8" w:color="000000"/>
           <w:bottom w:val="single" w:sz="8" w:color="000000"/>
@@ -11269,7 +11279,7 @@
         <w:t xml:space="preserve"> </w:t>
       </w:r>
       <w:r>
-        <w:t xml:space="preserve">With Bootstrap CI and DeLong</w:t>
+        <w:t xml:space="preserve">(Bootstrap CI, DeLong</w:t>
       </w:r>
       <w:r>
         <w:t xml:space="preserve"> </w:t>
@@ -11280,7 +11290,7 @@
         </m:r>
       </m:oMath>
       <w:r>
-        <w:t xml:space="preserve">-Value</w:t>
+        <w:t xml:space="preserve">)</w:t>
       </w:r>
     </w:p>
     <w:tbl>
@@ -11288,7 +11298,7 @@
         <w:tblStyle w:val="Table"/>
         <w:tblW w:type="auto" w:w="0"/>
         <w:tblLook w:firstRow="1" w:lastRow="0" w:firstColumn="0" w:lastColumn="0" w:noHBand="0" w:noVBand="0" w:val="0020"/>
-        <w:tblCaption w:val="SOH Ablation at H{=}20 With Bootstrap CI and DeLong p-Value"/>
+        <w:tblCaption w:val="SOH Ablation at H{=}20 (Bootstrap CI, DeLong p)"/>
         <w:tblBorders>
           <w:top w:val="single" w:sz="8" w:color="000000"/>
           <w:bottom w:val="single" w:sz="8" w:color="000000"/>
@@ -11429,7 +11439,7 @@
                 <w:bCs/>
                 <w:sz w:val="16"/>
               </w:rPr>
-              <w:t xml:space="preserve">AUC [CI]</w:t>
+              <w:t xml:space="preserve">AUC [95% CI]</w:t>
             </w:r>
           </w:p>
         </w:tc>
@@ -11553,7 +11563,7 @@
                 <w:rFonts w:ascii="Times New Roman" w:hAnsi="Times New Roman"/>
                 <w:sz w:val="16"/>
               </w:rPr>
-              <w:t xml:space="preserve">+0.488 (5 cells)</w:t>
+              <w:t xml:space="preserve">+0.488 [NA; n=5]</w:t>
             </w:r>
           </w:p>
         </w:tc>
@@ -11667,7 +11677,7 @@
                 <w:rFonts w:ascii="Times New Roman" w:hAnsi="Times New Roman"/>
                 <w:sz w:val="16"/>
               </w:rPr>
-              <w:t xml:space="preserve">+0.639 (5 cells)</w:t>
+              <w:t xml:space="preserve">+0.639 [NA; n=5]</w:t>
             </w:r>
           </w:p>
         </w:tc>
@@ -11781,7 +11791,7 @@
                 <w:rFonts w:ascii="Times New Roman" w:hAnsi="Times New Roman"/>
                 <w:sz w:val="16"/>
               </w:rPr>
-              <w:t xml:space="preserve">+0.409 (5 cells)</w:t>
+              <w:t xml:space="preserve">+0.409 [NA; n=5]</w:t>
             </w:r>
           </w:p>
         </w:tc>
@@ -12238,7 +12248,13 @@
         </m:r>
       </m:oMath>
       <w:r>
-        <w:t xml:space="preserve">-values, which are inflated by</w:t>
+        <w:t xml:space="preserve">-values, which treat correlated cycles</w:t>
+      </w:r>
+      <w:r>
+        <w:t xml:space="preserve"> </w:t>
+      </w:r>
+      <w:r>
+        <w:t xml:space="preserve">as independent and can therefore be anti-conservatively small under</w:t>
       </w:r>
       <w:r>
         <w:t xml:space="preserve"> </w:t>

</xml_diff>

<commit_message>
Conference: entire Keywords paragraph bold italic (was label-only bold)
</commit_message>
<xml_diff>
--- a/Multi_Horizon_Hazard_Models_for_Battery_Failure_Prediction_Within.docx
+++ b/Multi_Horizon_Hazard_Models_for_Battery_Failure_Prediction_Within.docx
@@ -433,24 +433,21 @@
           <w:i/>
           <w:iCs/>
         </w:rPr>
-        <w:t xml:space="preserve">Keywords—</w:t>
+        <w:t xml:space="preserve">Keywords—battery management</w:t>
       </w:r>
       <w:r>
         <w:rPr>
+          <w:b/>
+          <w:bCs/>
           <w:i/>
           <w:iCs/>
         </w:rPr>
-        <w:t xml:space="preserve">battery management</w:t>
+        <w:t xml:space="preserve"> </w:t>
       </w:r>
       <w:r>
         <w:rPr>
-          <w:i/>
-          <w:iCs/>
-        </w:rPr>
-        <w:t xml:space="preserve"> </w:t>
-      </w:r>
-      <w:r>
-        <w:rPr>
+          <w:b/>
+          <w:bCs/>
           <w:i/>
           <w:iCs/>
         </w:rPr>
@@ -458,6 +455,8 @@
       </w:r>
       <w:r>
         <w:rPr>
+          <w:b/>
+          <w:bCs/>
           <w:i/>
           <w:iCs/>
         </w:rPr>
@@ -465,6 +464,8 @@
       </w:r>
       <w:r>
         <w:rPr>
+          <w:b/>
+          <w:bCs/>
           <w:i/>
           <w:iCs/>
         </w:rPr>

</xml_diff>

<commit_message>
Conference: user-supplied abstract and conclusion text
</commit_message>
<xml_diff>
--- a/Multi_Horizon_Hazard_Models_for_Battery_Failure_Prediction_Within.docx
+++ b/Multi_Horizon_Hazard_Models_for_Battery_Failure_Prediction_Within.docx
@@ -41,7 +41,7 @@
           <w:b/>
           <w:sz w:val="18"/>
         </w:rPr>
-        <w:t xml:space="preserve">This paper presents a multi-horizon failure-risk prediction</w:t>
+        <w:t xml:space="preserve">This paper builds a multi-horizon failure-risk framework for</w:t>
       </w:r>
       <w:r>
         <w:rPr>
@@ -55,7 +55,7 @@
           <w:b/>
           <w:sz w:val="18"/>
         </w:rPr>
-        <w:t xml:space="preserve">framework for lithium-ion battery failure that integrates probability</w:t>
+        <w:t xml:space="preserve">lithium-ion batteries, one that combines probability calibration,</w:t>
       </w:r>
       <w:r>
         <w:rPr>
@@ -69,7 +69,7 @@
           <w:b/>
           <w:sz w:val="18"/>
         </w:rPr>
-        <w:t xml:space="preserve">calibration, cross-dataset evaluation, and statistical significance</w:t>
+        <w:t xml:space="preserve">cross-dataset evaluation, and significance testing, and uses it to ask</w:t>
       </w:r>
       <w:r>
         <w:rPr>
@@ -83,7 +83,7 @@
           <w:b/>
           <w:sz w:val="18"/>
         </w:rPr>
-        <w:t xml:space="preserve">testing, and uses it to answer a validity question: when failure-risk</w:t>
+        <w:t xml:space="preserve">a pointed question: when these models appear to transfer across</w:t>
       </w:r>
       <w:r>
         <w:rPr>
@@ -97,7 +97,7 @@
           <w:b/>
           <w:sz w:val="18"/>
         </w:rPr>
-        <w:t xml:space="preserve">models appear to transfer between datasets and chemistries, is</w:t>
+        <w:t xml:space="preserve">datasets and chemistries, are they actually learning something about</w:t>
       </w:r>
       <w:r>
         <w:rPr>
@@ -111,7 +111,7 @@
           <w:b/>
           <w:sz w:val="18"/>
         </w:rPr>
-        <w:t xml:space="preserve">degradation knowledge actually transferring, or is the model reading a</w:t>
+        <w:t xml:space="preserve">degradation, or are they just reading a health-state variable that</w:t>
       </w:r>
       <w:r>
         <w:rPr>
@@ -125,7 +125,7 @@
           <w:b/>
           <w:sz w:val="18"/>
         </w:rPr>
-        <w:t xml:space="preserve">health-state variable that encodes proximity to the failure criterion</w:t>
+        <w:t xml:space="preserve">already encodes how close a cell is to the failure line? We train</w:t>
       </w:r>
       <w:r>
         <w:rPr>
@@ -139,7 +139,7 @@
           <w:b/>
           <w:sz w:val="18"/>
         </w:rPr>
-        <w:t xml:space="preserve">itself? Three tree ensembles (XGBoost, LightGBM, Random Forest) and a</w:t>
+        <w:t xml:space="preserve">three tree ensembles (XGBoost, LightGBM, Random Forest) plus a GRU</w:t>
       </w:r>
       <w:r>
         <w:rPr>
@@ -153,7 +153,7 @@
           <w:b/>
           <w:sz w:val="18"/>
         </w:rPr>
-        <w:t xml:space="preserve">GRU baseline are trained on the NASA and CALCE LCO datasets under</w:t>
+        <w:t xml:space="preserve">baseline on the NASA and CALCE LCO datasets, then test them on the</w:t>
       </w:r>
       <w:r>
         <w:rPr>
@@ -167,7 +167,7 @@
           <w:b/>
           <w:sz w:val="18"/>
         </w:rPr>
-        <w:t xml:space="preserve">cell-disjoint folds with leakage-free, cross-fitted calibration, and</w:t>
+        <w:t xml:space="preserve">Oxford and Severson LFP datasets across four horizons. Within the</w:t>
       </w:r>
       <w:r>
         <w:rPr>
@@ -181,7 +181,7 @@
           <w:b/>
           <w:sz w:val="18"/>
         </w:rPr>
-        <w:t xml:space="preserve">evaluated on the Oxford and MIT–Stanford Severson LFP datasets across</w:t>
+        <w:t xml:space="preserve">training datasets, every model reaches an AUC of at least 0.85. But</w:t>
       </w:r>
       <w:r>
         <w:rPr>
@@ -195,7 +195,7 @@
           <w:b/>
           <w:sz w:val="18"/>
         </w:rPr>
-        <w:t xml:space="preserve">four horizons (10, 20, 30, 50 cycles). Under the clean protocol, every</w:t>
+        <w:t xml:space="preserve">the central finding is what happens under a State-of-Health (SOH)</w:t>
       </w:r>
       <w:r>
         <w:rPr>
@@ -209,7 +209,7 @@
           <w:b/>
           <w:sz w:val="18"/>
         </w:rPr>
-        <w:t xml:space="preserve">model–horizon–dataset combination reaches a fold-mean AUC of at least</w:t>
+        <w:t xml:space="preserve">ablation: cross-dataset transfer that looks near-perfect with SOH</w:t>
       </w:r>
       <w:r>
         <w:rPr>
@@ -223,7 +223,7 @@
           <w:b/>
           <w:sz w:val="18"/>
         </w:rPr>
-        <w:t xml:space="preserve">0.85 (32 of 32), and Platt scaling better preserves discrimination than</w:t>
+        <w:t xml:space="preserve">included (AUC up to 1.00) collapses to as low as 0.58 once SOH is</w:t>
       </w:r>
       <w:r>
         <w:rPr>
@@ -237,7 +237,7 @@
           <w:b/>
           <w:sz w:val="18"/>
         </w:rPr>
-        <w:t xml:space="preserve">isotonic regression while achieving comparable or better calibration</w:t>
+        <w:t xml:space="preserve">removed, and a simple, unfitted rule based on distance to the SOH</w:t>
       </w:r>
       <w:r>
         <w:rPr>
@@ -251,7 +251,7 @@
           <w:b/>
           <w:sz w:val="18"/>
         </w:rPr>
-        <w:t xml:space="preserve">error. The central result is a controlled State-of-Health (SOH)</w:t>
+        <w:t xml:space="preserve">threshold reproduces most of that</w:t>
       </w:r>
       <w:r>
         <w:rPr>
@@ -265,7 +265,7 @@
           <w:b/>
           <w:sz w:val="18"/>
         </w:rPr>
-        <w:t xml:space="preserve">ablation: apparent cross-dataset, cross-chemistry transfer with SOH</w:t>
+        <w:t xml:space="preserve">“transfer”</w:t>
       </w:r>
       <w:r>
         <w:rPr>
@@ -279,7 +279,7 @@
           <w:b/>
           <w:sz w:val="18"/>
         </w:rPr>
-        <w:t xml:space="preserve">included (pooled AUC up to 1.00) collapses without SOH (at best 0.58 at</w:t>
+        <w:t xml:space="preserve">on its own. Because SOH</w:t>
       </w:r>
       <w:r>
         <w:rPr>
@@ -288,26 +288,12 @@
         </w:rPr>
         <w:t xml:space="preserve"> </w:t>
       </w:r>
-      <m:oMath>
-        <m:r>
-          <m:t>H</m:t>
-        </m:r>
-        <m:r>
-          <m:rPr>
-            <m:sty m:val="p"/>
-          </m:rPr>
-          <m:t>=</m:t>
-        </m:r>
-        <m:r>
-          <m:t>20</m:t>
-        </m:r>
-      </m:oMath>
       <w:r>
         <w:rPr>
           <w:b/>
           <w:sz w:val="18"/>
         </w:rPr>
-        <w:t xml:space="preserve">), and an unfitted distance-to-threshold rule on SOH alone</w:t>
+        <w:t xml:space="preserve">also partly defines the failure label itself, these with-SOH numbers</w:t>
       </w:r>
       <w:r>
         <w:rPr>
@@ -321,7 +307,7 @@
           <w:b/>
           <w:sz w:val="18"/>
         </w:rPr>
-        <w:t xml:space="preserve">reproduces most of the with-SOH transfer. Because SOH also enters the</w:t>
+        <w:t xml:space="preserve">are upper bounds; relabeling failure using voltage sag alone cuts the</w:t>
       </w:r>
       <w:r>
         <w:rPr>
@@ -335,7 +321,7 @@
           <w:b/>
           <w:sz w:val="18"/>
         </w:rPr>
-        <w:t xml:space="preserve">failure definition, all with-SOH numbers are upper bounds that partly</w:t>
+        <w:t xml:space="preserve">apparent transfer by a quarter. Same-chemistry controls show the</w:t>
       </w:r>
       <w:r>
         <w:rPr>
@@ -349,7 +335,7 @@
           <w:b/>
           <w:sz w:val="18"/>
         </w:rPr>
-        <w:t xml:space="preserve">measure label proximity: relabeling failure by voltage sag alone cuts</w:t>
+        <w:t xml:space="preserve">collapse tracks dataset shift as much as chemistry shift, so SOH is</w:t>
       </w:r>
       <w:r>
         <w:rPr>
@@ -363,7 +349,7 @@
           <w:b/>
           <w:sz w:val="18"/>
         </w:rPr>
-        <w:t xml:space="preserve">with-SOH transfer by a quarter. Same-chemistry cross-laboratory</w:t>
+        <w:t xml:space="preserve">acting as a shortcut tied to the dataset and chemistry, not a</w:t>
       </w:r>
       <w:r>
         <w:rPr>
@@ -377,49 +363,7 @@
           <w:b/>
           <w:sz w:val="18"/>
         </w:rPr>
-        <w:t xml:space="preserve">controls show the collapse is driven by dataset shift at least as much</w:t>
-      </w:r>
-      <w:r>
-        <w:rPr>
-          <w:b/>
-          <w:sz w:val="18"/>
-        </w:rPr>
-        <w:t xml:space="preserve"> </w:t>
-      </w:r>
-      <w:r>
-        <w:rPr>
-          <w:b/>
-          <w:sz w:val="18"/>
-        </w:rPr>
-        <w:t xml:space="preserve">as by chemistry, so SOH acts as a dataset- and chemistry-dependent</w:t>
-      </w:r>
-      <w:r>
-        <w:rPr>
-          <w:b/>
-          <w:sz w:val="18"/>
-        </w:rPr>
-        <w:t xml:space="preserve"> </w:t>
-      </w:r>
-      <w:r>
-        <w:rPr>
-          <w:b/>
-          <w:sz w:val="18"/>
-        </w:rPr>
-        <w:t xml:space="preserve">health-state shortcut rather than a chemistry-specific transferable</w:t>
-      </w:r>
-      <w:r>
-        <w:rPr>
-          <w:b/>
-          <w:sz w:val="18"/>
-        </w:rPr>
-        <w:t xml:space="preserve"> </w:t>
-      </w:r>
-      <w:r>
-        <w:rPr>
-          <w:b/>
-          <w:sz w:val="18"/>
-        </w:rPr>
-        <w:t xml:space="preserve">signal.</w:t>
+        <w:t xml:space="preserve">genuinely transferable signal.</w:t>
       </w:r>
     </w:p>
     <w:p>
@@ -12470,117 +12414,97 @@
         <w:pStyle w:val="FirstParagraph"/>
       </w:pPr>
       <w:r>
-        <w:t xml:space="preserve">This paper presented a multi-horizon failure-risk framework for</w:t>
-      </w:r>
-      <w:r>
-        <w:t xml:space="preserve"> </w:t>
-      </w:r>
-      <w:r>
-        <w:t xml:space="preserve">predicting lithium-ion battery failure across multiple datasets and</w:t>
-      </w:r>
-      <w:r>
-        <w:t xml:space="preserve"> </w:t>
-      </w:r>
-      <w:r>
-        <w:t xml:space="preserve">chemistries, and used it to run a validity analysis rather than only a</w:t>
-      </w:r>
-      <w:r>
-        <w:t xml:space="preserve"> </w:t>
-      </w:r>
-      <w:r>
-        <w:t xml:space="preserve">benchmark. Under cell-disjoint evaluation with leakage-free</w:t>
-      </w:r>
-      <w:r>
-        <w:t xml:space="preserve"> </w:t>
-      </w:r>
-      <w:r>
-        <w:t xml:space="preserve">cross-fitted calibration, within-dataset performance is uniformly</w:t>
-      </w:r>
-      <w:r>
-        <w:t xml:space="preserve"> </w:t>
-      </w:r>
-      <w:r>
-        <w:t xml:space="preserve">strong (fold-mean AUC</w:t>
-      </w:r>
-      <w:r>
-        <w:t xml:space="preserve"> </w:t>
-      </w:r>
-      <m:oMath>
-        <m:r>
-          <m:rPr>
-            <m:sty m:val="p"/>
-          </m:rPr>
-          <m:t>≥</m:t>
-        </m:r>
-        <m:r>
-          <m:t>0.85</m:t>
-        </m:r>
-      </m:oMath>
-      <w:r>
-        <w:t xml:space="preserve"> </w:t>
-      </w:r>
-      <w:r>
-        <w:t xml:space="preserve">in all 32 model–horizon–dataset</w:t>
-      </w:r>
-      <w:r>
-        <w:t xml:space="preserve"> </w:t>
-      </w:r>
-      <w:r>
-        <w:t xml:space="preserve">combinations). The cross-dataset results support a narrower and more</w:t>
-      </w:r>
-      <w:r>
-        <w:t xml:space="preserve"> </w:t>
-      </w:r>
-      <w:r>
-        <w:t xml:space="preserve">useful conclusion than apparent transfer success suggests: much of the</w:t>
-      </w:r>
-      <w:r>
-        <w:t xml:space="preserve"> </w:t>
-      </w:r>
-      <w:r>
-        <w:t xml:space="preserve">observed cross-dataset, cross-chemistry discrimination is attributable</w:t>
-      </w:r>
-      <w:r>
-        <w:t xml:space="preserve"> </w:t>
-      </w:r>
-      <w:r>
-        <w:t xml:space="preserve">to SOH, partly because SOH defines the failure criterion itself</w:t>
-      </w:r>
-      <w:r>
-        <w:t xml:space="preserve"> </w:t>
-      </w:r>
-      <w:r>
-        <w:t xml:space="preserve">(quantified by the failure-endpoint ablation), rather than to</w:t>
-      </w:r>
-      <w:r>
-        <w:t xml:space="preserve"> </w:t>
-      </w:r>
-      <w:r>
-        <w:t xml:space="preserve">degradation information in the remaining measured features, and</w:t>
-      </w:r>
-      <w:r>
-        <w:t xml:space="preserve"> </w:t>
-      </w:r>
-      <w:r>
-        <w:t xml:space="preserve">same-chemistry controls attribute the collapse to dataset shift at</w:t>
-      </w:r>
-      <w:r>
-        <w:t xml:space="preserve"> </w:t>
-      </w:r>
-      <w:r>
-        <w:t xml:space="preserve">least as much as to chemistry. Platt scaling preserves discrimination</w:t>
-      </w:r>
-      <w:r>
-        <w:t xml:space="preserve"> </w:t>
-      </w:r>
-      <w:r>
-        <w:t xml:space="preserve">best at comparable calibration error, though no source-fitted</w:t>
-      </w:r>
-      <w:r>
-        <w:t xml:space="preserve"> </w:t>
-      </w:r>
-      <w:r>
-        <w:t xml:space="preserve">calibrator repairs calibration on the shifted target.</w:t>
+        <w:t xml:space="preserve">This paper built a multi-horizon failure-risk framework for</w:t>
+      </w:r>
+      <w:r>
+        <w:t xml:space="preserve"> </w:t>
+      </w:r>
+      <w:r>
+        <w:t xml:space="preserve">lithium-ion batteries across datasets and chemistries, and used it to</w:t>
+      </w:r>
+      <w:r>
+        <w:t xml:space="preserve"> </w:t>
+      </w:r>
+      <w:r>
+        <w:t xml:space="preserve">run a validity check rather than just another benchmark. Under</w:t>
+      </w:r>
+      <w:r>
+        <w:t xml:space="preserve"> </w:t>
+      </w:r>
+      <w:r>
+        <w:t xml:space="preserve">cell-disjoint evaluation with leakage-free calibration, performance</w:t>
+      </w:r>
+      <w:r>
+        <w:t xml:space="preserve"> </w:t>
+      </w:r>
+      <w:r>
+        <w:t xml:space="preserve">within each training dataset is consistently strong, every one of the</w:t>
+      </w:r>
+      <w:r>
+        <w:t xml:space="preserve"> </w:t>
+      </w:r>
+      <w:r>
+        <w:t xml:space="preserve">32 model–horizon–dataset combinations reaches a fold-mean AUC above</w:t>
+      </w:r>
+      <w:r>
+        <w:t xml:space="preserve"> </w:t>
+      </w:r>
+      <w:r>
+        <w:t xml:space="preserve">0.85. But the cross-dataset results point to a narrower and more</w:t>
+      </w:r>
+      <w:r>
+        <w:t xml:space="preserve"> </w:t>
+      </w:r>
+      <w:r>
+        <w:t xml:space="preserve">useful conclusion than the raw transfer numbers suggest: most of the</w:t>
+      </w:r>
+      <w:r>
+        <w:t xml:space="preserve"> </w:t>
+      </w:r>
+      <w:r>
+        <w:t xml:space="preserve">apparent cross-dataset, cross-chemistry discrimination comes down to</w:t>
+      </w:r>
+      <w:r>
+        <w:t xml:space="preserve"> </w:t>
+      </w:r>
+      <w:r>
+        <w:t xml:space="preserve">SOH, partly because SOH is baked into how failure is defined in the</w:t>
+      </w:r>
+      <w:r>
+        <w:t xml:space="preserve"> </w:t>
+      </w:r>
+      <w:r>
+        <w:t xml:space="preserve">first place, not because the remaining measured features carry real</w:t>
+      </w:r>
+      <w:r>
+        <w:t xml:space="preserve"> </w:t>
+      </w:r>
+      <w:r>
+        <w:t xml:space="preserve">degradation information. Same-chemistry controls back this up, showing</w:t>
+      </w:r>
+      <w:r>
+        <w:t xml:space="preserve"> </w:t>
+      </w:r>
+      <w:r>
+        <w:t xml:space="preserve">the collapse tracks dataset shift just as much as it tracks chemistry</w:t>
+      </w:r>
+      <w:r>
+        <w:t xml:space="preserve"> </w:t>
+      </w:r>
+      <w:r>
+        <w:t xml:space="preserve">shift. Platt scaling comes out ahead for preserving discrimination at</w:t>
+      </w:r>
+      <w:r>
+        <w:t xml:space="preserve"> </w:t>
+      </w:r>
+      <w:r>
+        <w:t xml:space="preserve">comparable calibration error, though no calibrator fitted on the</w:t>
+      </w:r>
+      <w:r>
+        <w:t xml:space="preserve"> </w:t>
+      </w:r>
+      <w:r>
+        <w:t xml:space="preserve">source data actually repairs calibration once the target has shifted.</w:t>
       </w:r>
     </w:p>
     <w:p>
@@ -12588,55 +12512,61 @@
         <w:pStyle w:val="BodyText"/>
       </w:pPr>
       <w:r>
-        <w:t xml:space="preserve">Several limitations bound these claims: the fixed-horizon</w:t>
-      </w:r>
-      <w:r>
-        <w:t xml:space="preserve"> </w:t>
-      </w:r>
-      <w:r>
-        <w:t xml:space="preserve">classifiers have no enforced monotonicity across horizons; Oxford’s</w:t>
-      </w:r>
-      <w:r>
-        <w:t xml:space="preserve"> </w:t>
-      </w:r>
-      <w:r>
-        <w:t xml:space="preserve">coarse 100-cycle sampling limits it to pooled-detection use; CALCE</w:t>
-      </w:r>
-      <w:r>
-        <w:t xml:space="preserve"> </w:t>
-      </w:r>
-      <w:r>
-        <w:t xml:space="preserve">contributes only seven cells; cross-chemistry evaluation covered LCO</w:t>
-      </w:r>
-      <w:r>
-        <w:t xml:space="preserve"> </w:t>
-      </w:r>
-      <w:r>
-        <w:t xml:space="preserve">and LFP only; and all datasets are laboratory-scale. Future work will</w:t>
-      </w:r>
-      <w:r>
-        <w:t xml:space="preserve"> </w:t>
-      </w:r>
-      <w:r>
-        <w:t xml:space="preserve">extend the framework to minimal-feature baselines as standard</w:t>
-      </w:r>
-      <w:r>
-        <w:t xml:space="preserve"> </w:t>
-      </w:r>
-      <w:r>
-        <w:t xml:space="preserve">practice, controlled same-laboratory cross-chemistry campaigns,</w:t>
-      </w:r>
-      <w:r>
-        <w:t xml:space="preserve"> </w:t>
-      </w:r>
-      <w:r>
-        <w:t xml:space="preserve">continuous time-to-failure modeling, and validation on large-scale</w:t>
-      </w:r>
-      <w:r>
-        <w:t xml:space="preserve"> </w:t>
-      </w:r>
-      <w:r>
-        <w:t xml:space="preserve">industrial datasets.</w:t>
+        <w:t xml:space="preserve">A few limits are worth flagging. The fixed-horizon classifiers don’t</w:t>
+      </w:r>
+      <w:r>
+        <w:t xml:space="preserve"> </w:t>
+      </w:r>
+      <w:r>
+        <w:t xml:space="preserve">enforce any monotonicity across horizons. Oxford’s coarse, 100-cycle</w:t>
+      </w:r>
+      <w:r>
+        <w:t xml:space="preserve"> </w:t>
+      </w:r>
+      <w:r>
+        <w:t xml:space="preserve">sampling means it only supports pooled-detection use rather than</w:t>
+      </w:r>
+      <w:r>
+        <w:t xml:space="preserve"> </w:t>
+      </w:r>
+      <w:r>
+        <w:t xml:space="preserve">horizon-specific claims. CALCE contributes just seven cells.</w:t>
+      </w:r>
+      <w:r>
+        <w:t xml:space="preserve"> </w:t>
+      </w:r>
+      <w:r>
+        <w:t xml:space="preserve">Cross-chemistry testing here only covers LCO and LFP. And all four</w:t>
+      </w:r>
+      <w:r>
+        <w:t xml:space="preserve"> </w:t>
+      </w:r>
+      <w:r>
+        <w:t xml:space="preserve">datasets are lab-scale rather than field data. Next steps include</w:t>
+      </w:r>
+      <w:r>
+        <w:t xml:space="preserve"> </w:t>
+      </w:r>
+      <w:r>
+        <w:t xml:space="preserve">making minimal-feature baselines standard practice, running controlled</w:t>
+      </w:r>
+      <w:r>
+        <w:t xml:space="preserve"> </w:t>
+      </w:r>
+      <w:r>
+        <w:t xml:space="preserve">same-lab cross-chemistry campaigns, moving toward continuous</w:t>
+      </w:r>
+      <w:r>
+        <w:t xml:space="preserve"> </w:t>
+      </w:r>
+      <w:r>
+        <w:t xml:space="preserve">time-to-failure modeling, and testing all of this against larger,</w:t>
+      </w:r>
+      <w:r>
+        <w:t xml:space="preserve"> </w:t>
+      </w:r>
+      <w:r>
+        <w:t xml:space="preserve">industrial-scale datasets.</w:t>
       </w:r>
     </w:p>
     <w:bookmarkEnd w:id="48"/>

</xml_diff>